<commit_message>
Add location in resume
</commit_message>
<xml_diff>
--- a/Resume - Harshit Jindal [OCT 2022] - Final.docx
+++ b/Resume - Harshit Jindal [OCT 2022] - Final.docx
@@ -1,6 +1,6 @@
 
 <file path=word/document.xml><?xml version="1.0" encoding="utf-8"?>
-<w:document xmlns:wpc="http://schemas.microsoft.com/office/word/2010/wordprocessingCanvas" xmlns:cx="http://schemas.microsoft.com/office/drawing/2014/chartex" xmlns:cx1="http://schemas.microsoft.com/office/drawing/2015/9/8/chartex" xmlns:cx2="http://schemas.microsoft.com/office/drawing/2015/10/21/chartex" xmlns:cx3="http://schemas.microsoft.com/office/drawing/2016/5/9/chartex" xmlns:cx4="http://schemas.microsoft.com/office/drawing/2016/5/10/chartex" xmlns:cx5="http://schemas.microsoft.com/office/drawing/2016/5/11/chartex" xmlns:cx6="http://schemas.microsoft.com/office/drawing/2016/5/12/chartex" xmlns:cx7="http://schemas.microsoft.com/office/drawing/2016/5/13/chartex" xmlns:cx8="http://schemas.microsoft.com/office/drawing/2016/5/14/chartex" xmlns:mc="http://schemas.openxmlformats.org/markup-compatibility/2006" xmlns:aink="http://schemas.microsoft.com/office/drawing/2016/ink" xmlns:am3d="http://schemas.microsoft.com/office/drawing/2017/model3d" xmlns:o="urn:schemas-microsoft-com:office:office" xmlns:r="http://schemas.openxmlformats.org/officeDocument/2006/relationships" xmlns:m="http://schemas.openxmlformats.org/officeDocument/2006/math" xmlns:v="urn:schemas-microsoft-com:vml" xmlns:wp14="http://schemas.microsoft.com/office/word/2010/wordprocessingDrawing" xmlns:wp="http://schemas.openxmlformats.org/drawingml/2006/wordprocessingDrawing" xmlns:w10="urn:schemas-microsoft-com:office:word" xmlns:w="http://schemas.openxmlformats.org/wordprocessingml/2006/main" xmlns:w14="http://schemas.microsoft.com/office/word/2010/wordml" xmlns:w15="http://schemas.microsoft.com/office/word/2012/wordml" xmlns:w16cex="http://schemas.microsoft.com/office/word/2018/wordml/cex" xmlns:w16cid="http://schemas.microsoft.com/office/word/2016/wordml/cid" xmlns:w16="http://schemas.microsoft.com/office/word/2018/wordml" xmlns:w16sdtdh="http://schemas.microsoft.com/office/word/2020/wordml/sdtdatahash" xmlns:w16se="http://schemas.microsoft.com/office/word/2015/wordml/symex" xmlns:wpg="http://schemas.microsoft.com/office/word/2010/wordprocessingGroup" xmlns:wpi="http://schemas.microsoft.com/office/word/2010/wordprocessingInk" xmlns:wne="http://schemas.microsoft.com/office/word/2006/wordml" xmlns:wps="http://schemas.microsoft.com/office/word/2010/wordprocessingShape" mc:Ignorable="w14 w15 w16se w16cid w16 w16cex w16sdtdh wp14">
+<w:document xmlns:wpc="http://schemas.microsoft.com/office/word/2010/wordprocessingCanvas" xmlns:cx="http://schemas.microsoft.com/office/drawing/2014/chartex" xmlns:cx1="http://schemas.microsoft.com/office/drawing/2015/9/8/chartex" xmlns:cx2="http://schemas.microsoft.com/office/drawing/2015/10/21/chartex" xmlns:cx3="http://schemas.microsoft.com/office/drawing/2016/5/9/chartex" xmlns:cx4="http://schemas.microsoft.com/office/drawing/2016/5/10/chartex" xmlns:cx5="http://schemas.microsoft.com/office/drawing/2016/5/11/chartex" xmlns:cx6="http://schemas.microsoft.com/office/drawing/2016/5/12/chartex" xmlns:cx7="http://schemas.microsoft.com/office/drawing/2016/5/13/chartex" xmlns:cx8="http://schemas.microsoft.com/office/drawing/2016/5/14/chartex" xmlns:mc="http://schemas.openxmlformats.org/markup-compatibility/2006" xmlns:aink="http://schemas.microsoft.com/office/drawing/2016/ink" xmlns:am3d="http://schemas.microsoft.com/office/drawing/2017/model3d" xmlns:o="urn:schemas-microsoft-com:office:office" xmlns:r="http://schemas.openxmlformats.org/officeDocument/2006/relationships" xmlns:m="http://schemas.openxmlformats.org/officeDocument/2006/math" xmlns:v="urn:schemas-microsoft-com:vml" xmlns:wp14="http://schemas.microsoft.com/office/word/2010/wordprocessingDrawing" xmlns:wp="http://schemas.openxmlformats.org/drawingml/2006/wordprocessingDrawing" xmlns:w10="urn:schemas-microsoft-com:office:word" xmlns:w="http://schemas.openxmlformats.org/wordprocessingml/2006/main" xmlns:w14="http://schemas.microsoft.com/office/word/2010/wordml" xmlns:w15="http://schemas.microsoft.com/office/word/2012/wordml" xmlns:w16cex="http://schemas.microsoft.com/office/word/2018/wordml/cex" xmlns:w16cid="http://schemas.microsoft.com/office/word/2016/wordml/cid" xmlns:w16="http://schemas.microsoft.com/office/word/2018/wordml" xmlns:w16se="http://schemas.microsoft.com/office/word/2015/wordml/symex" xmlns:wpg="http://schemas.microsoft.com/office/word/2010/wordprocessingGroup" xmlns:wpi="http://schemas.microsoft.com/office/word/2010/wordprocessingInk" xmlns:wne="http://schemas.microsoft.com/office/word/2006/wordml" xmlns:wps="http://schemas.microsoft.com/office/word/2010/wordprocessingShape" mc:Ignorable="w14 w15 w16se w16cid w16 w16cex wp14">
   <w:body>
     <w:tbl>
       <w:tblPr>
@@ -10,8 +10,8 @@
         <w:tblLook w:val="01E0" w:firstRow="1" w:lastRow="1" w:firstColumn="1" w:lastColumn="1" w:noHBand="0" w:noVBand="0"/>
       </w:tblPr>
       <w:tblGrid>
-        <w:gridCol w:w="1862"/>
-        <w:gridCol w:w="468"/>
+        <w:gridCol w:w="1952"/>
+        <w:gridCol w:w="378"/>
         <w:gridCol w:w="29"/>
         <w:gridCol w:w="1152"/>
         <w:gridCol w:w="3401"/>
@@ -70,6 +70,14 @@
                 <w:szCs w:val="20"/>
               </w:rPr>
               <w:t>Software Engineer</w:t>
+            </w:r>
+            <w:r>
+              <w:rPr>
+                <w:rFonts w:ascii="Calibri" w:hAnsi="Calibri" w:cs="Calibri"/>
+                <w:sz w:val="20"/>
+                <w:szCs w:val="20"/>
+              </w:rPr>
+              <w:t xml:space="preserve"> | India</w:t>
             </w:r>
           </w:p>
         </w:tc>
@@ -238,7 +246,7 @@
         </w:trPr>
         <w:tc>
           <w:tcPr>
-            <w:tcW w:w="887" w:type="pct"/>
+            <w:tcW w:w="930" w:type="pct"/>
             <w:tcBorders>
               <w:top w:val="single" w:sz="4" w:space="0" w:color="auto"/>
             </w:tcBorders>
@@ -255,22 +263,11 @@
                 <w:szCs w:val="20"/>
               </w:rPr>
             </w:pPr>
-            <w:r>
-              <w:rPr>
-                <w:rFonts w:ascii="Calibri" w:hAnsi="Calibri" w:cs="Calibri"/>
-                <w:b/>
-                <w:i/>
-                <w:iCs/>
-                <w:sz w:val="20"/>
-                <w:szCs w:val="20"/>
-              </w:rPr>
-              <w:t>Chandigarh, India</w:t>
-            </w:r>
           </w:p>
         </w:tc>
         <w:tc>
           <w:tcPr>
-            <w:tcW w:w="3083" w:type="pct"/>
+            <w:tcW w:w="3040" w:type="pct"/>
             <w:gridSpan w:val="6"/>
             <w:tcBorders>
               <w:top w:val="single" w:sz="4" w:space="0" w:color="auto"/>
@@ -299,7 +296,18 @@
                 <w:sz w:val="20"/>
                 <w:szCs w:val="20"/>
               </w:rPr>
-              <w:t>University Institute of Engineering and Technology, Panjab University</w:t>
+              <w:t>Panjab University</w:t>
+            </w:r>
+            <w:r>
+              <w:rPr>
+                <w:rFonts w:ascii="Calibri" w:hAnsi="Calibri" w:cs="Calibri"/>
+                <w:b/>
+                <w:i/>
+                <w:iCs/>
+                <w:sz w:val="20"/>
+                <w:szCs w:val="20"/>
+              </w:rPr>
+              <w:t>, India</w:t>
             </w:r>
           </w:p>
         </w:tc>
@@ -2640,7 +2648,7 @@
 </file>
 
 <file path=word/endnotes.xml><?xml version="1.0" encoding="utf-8"?>
-<w:endnotes xmlns:wpc="http://schemas.microsoft.com/office/word/2010/wordprocessingCanvas" xmlns:cx="http://schemas.microsoft.com/office/drawing/2014/chartex" xmlns:cx1="http://schemas.microsoft.com/office/drawing/2015/9/8/chartex" xmlns:cx2="http://schemas.microsoft.com/office/drawing/2015/10/21/chartex" xmlns:cx3="http://schemas.microsoft.com/office/drawing/2016/5/9/chartex" xmlns:cx4="http://schemas.microsoft.com/office/drawing/2016/5/10/chartex" xmlns:cx5="http://schemas.microsoft.com/office/drawing/2016/5/11/chartex" xmlns:cx6="http://schemas.microsoft.com/office/drawing/2016/5/12/chartex" xmlns:cx7="http://schemas.microsoft.com/office/drawing/2016/5/13/chartex" xmlns:cx8="http://schemas.microsoft.com/office/drawing/2016/5/14/chartex" xmlns:mc="http://schemas.openxmlformats.org/markup-compatibility/2006" xmlns:aink="http://schemas.microsoft.com/office/drawing/2016/ink" xmlns:am3d="http://schemas.microsoft.com/office/drawing/2017/model3d" xmlns:o="urn:schemas-microsoft-com:office:office" xmlns:r="http://schemas.openxmlformats.org/officeDocument/2006/relationships" xmlns:m="http://schemas.openxmlformats.org/officeDocument/2006/math" xmlns:v="urn:schemas-microsoft-com:vml" xmlns:wp14="http://schemas.microsoft.com/office/word/2010/wordprocessingDrawing" xmlns:wp="http://schemas.openxmlformats.org/drawingml/2006/wordprocessingDrawing" xmlns:w10="urn:schemas-microsoft-com:office:word" xmlns:w="http://schemas.openxmlformats.org/wordprocessingml/2006/main" xmlns:w14="http://schemas.microsoft.com/office/word/2010/wordml" xmlns:w15="http://schemas.microsoft.com/office/word/2012/wordml" xmlns:w16cex="http://schemas.microsoft.com/office/word/2018/wordml/cex" xmlns:w16cid="http://schemas.microsoft.com/office/word/2016/wordml/cid" xmlns:w16="http://schemas.microsoft.com/office/word/2018/wordml" xmlns:w16sdtdh="http://schemas.microsoft.com/office/word/2020/wordml/sdtdatahash" xmlns:w16se="http://schemas.microsoft.com/office/word/2015/wordml/symex" xmlns:wpg="http://schemas.microsoft.com/office/word/2010/wordprocessingGroup" xmlns:wpi="http://schemas.microsoft.com/office/word/2010/wordprocessingInk" xmlns:wne="http://schemas.microsoft.com/office/word/2006/wordml" xmlns:wps="http://schemas.microsoft.com/office/word/2010/wordprocessingShape" mc:Ignorable="w14 w15 w16se w16cid w16 w16cex w16sdtdh wp14">
+<w:endnotes xmlns:wpc="http://schemas.microsoft.com/office/word/2010/wordprocessingCanvas" xmlns:cx="http://schemas.microsoft.com/office/drawing/2014/chartex" xmlns:cx1="http://schemas.microsoft.com/office/drawing/2015/9/8/chartex" xmlns:cx2="http://schemas.microsoft.com/office/drawing/2015/10/21/chartex" xmlns:cx3="http://schemas.microsoft.com/office/drawing/2016/5/9/chartex" xmlns:cx4="http://schemas.microsoft.com/office/drawing/2016/5/10/chartex" xmlns:cx5="http://schemas.microsoft.com/office/drawing/2016/5/11/chartex" xmlns:cx6="http://schemas.microsoft.com/office/drawing/2016/5/12/chartex" xmlns:cx7="http://schemas.microsoft.com/office/drawing/2016/5/13/chartex" xmlns:cx8="http://schemas.microsoft.com/office/drawing/2016/5/14/chartex" xmlns:mc="http://schemas.openxmlformats.org/markup-compatibility/2006" xmlns:aink="http://schemas.microsoft.com/office/drawing/2016/ink" xmlns:am3d="http://schemas.microsoft.com/office/drawing/2017/model3d" xmlns:o="urn:schemas-microsoft-com:office:office" xmlns:r="http://schemas.openxmlformats.org/officeDocument/2006/relationships" xmlns:m="http://schemas.openxmlformats.org/officeDocument/2006/math" xmlns:v="urn:schemas-microsoft-com:vml" xmlns:wp14="http://schemas.microsoft.com/office/word/2010/wordprocessingDrawing" xmlns:wp="http://schemas.openxmlformats.org/drawingml/2006/wordprocessingDrawing" xmlns:w10="urn:schemas-microsoft-com:office:word" xmlns:w="http://schemas.openxmlformats.org/wordprocessingml/2006/main" xmlns:w14="http://schemas.microsoft.com/office/word/2010/wordml" xmlns:w15="http://schemas.microsoft.com/office/word/2012/wordml" xmlns:w16cex="http://schemas.microsoft.com/office/word/2018/wordml/cex" xmlns:w16cid="http://schemas.microsoft.com/office/word/2016/wordml/cid" xmlns:w16="http://schemas.microsoft.com/office/word/2018/wordml" xmlns:w16se="http://schemas.microsoft.com/office/word/2015/wordml/symex" xmlns:wpg="http://schemas.microsoft.com/office/word/2010/wordprocessingGroup" xmlns:wpi="http://schemas.microsoft.com/office/word/2010/wordprocessingInk" xmlns:wne="http://schemas.microsoft.com/office/word/2006/wordml" xmlns:wps="http://schemas.microsoft.com/office/word/2010/wordprocessingShape" mc:Ignorable="w14 w15 w16se w16cid w16 w16cex wp14">
   <w:endnote w:type="separator" w:id="-1">
     <w:p>
       <w:r>
@@ -2659,7 +2667,7 @@
 </file>
 
 <file path=word/footnotes.xml><?xml version="1.0" encoding="utf-8"?>
-<w:footnotes xmlns:wpc="http://schemas.microsoft.com/office/word/2010/wordprocessingCanvas" xmlns:cx="http://schemas.microsoft.com/office/drawing/2014/chartex" xmlns:cx1="http://schemas.microsoft.com/office/drawing/2015/9/8/chartex" xmlns:cx2="http://schemas.microsoft.com/office/drawing/2015/10/21/chartex" xmlns:cx3="http://schemas.microsoft.com/office/drawing/2016/5/9/chartex" xmlns:cx4="http://schemas.microsoft.com/office/drawing/2016/5/10/chartex" xmlns:cx5="http://schemas.microsoft.com/office/drawing/2016/5/11/chartex" xmlns:cx6="http://schemas.microsoft.com/office/drawing/2016/5/12/chartex" xmlns:cx7="http://schemas.microsoft.com/office/drawing/2016/5/13/chartex" xmlns:cx8="http://schemas.microsoft.com/office/drawing/2016/5/14/chartex" xmlns:mc="http://schemas.openxmlformats.org/markup-compatibility/2006" xmlns:aink="http://schemas.microsoft.com/office/drawing/2016/ink" xmlns:am3d="http://schemas.microsoft.com/office/drawing/2017/model3d" xmlns:o="urn:schemas-microsoft-com:office:office" xmlns:r="http://schemas.openxmlformats.org/officeDocument/2006/relationships" xmlns:m="http://schemas.openxmlformats.org/officeDocument/2006/math" xmlns:v="urn:schemas-microsoft-com:vml" xmlns:wp14="http://schemas.microsoft.com/office/word/2010/wordprocessingDrawing" xmlns:wp="http://schemas.openxmlformats.org/drawingml/2006/wordprocessingDrawing" xmlns:w10="urn:schemas-microsoft-com:office:word" xmlns:w="http://schemas.openxmlformats.org/wordprocessingml/2006/main" xmlns:w14="http://schemas.microsoft.com/office/word/2010/wordml" xmlns:w15="http://schemas.microsoft.com/office/word/2012/wordml" xmlns:w16cex="http://schemas.microsoft.com/office/word/2018/wordml/cex" xmlns:w16cid="http://schemas.microsoft.com/office/word/2016/wordml/cid" xmlns:w16="http://schemas.microsoft.com/office/word/2018/wordml" xmlns:w16sdtdh="http://schemas.microsoft.com/office/word/2020/wordml/sdtdatahash" xmlns:w16se="http://schemas.microsoft.com/office/word/2015/wordml/symex" xmlns:wpg="http://schemas.microsoft.com/office/word/2010/wordprocessingGroup" xmlns:wpi="http://schemas.microsoft.com/office/word/2010/wordprocessingInk" xmlns:wne="http://schemas.microsoft.com/office/word/2006/wordml" xmlns:wps="http://schemas.microsoft.com/office/word/2010/wordprocessingShape" mc:Ignorable="w14 w15 w16se w16cid w16 w16cex w16sdtdh wp14">
+<w:footnotes xmlns:wpc="http://schemas.microsoft.com/office/word/2010/wordprocessingCanvas" xmlns:cx="http://schemas.microsoft.com/office/drawing/2014/chartex" xmlns:cx1="http://schemas.microsoft.com/office/drawing/2015/9/8/chartex" xmlns:cx2="http://schemas.microsoft.com/office/drawing/2015/10/21/chartex" xmlns:cx3="http://schemas.microsoft.com/office/drawing/2016/5/9/chartex" xmlns:cx4="http://schemas.microsoft.com/office/drawing/2016/5/10/chartex" xmlns:cx5="http://schemas.microsoft.com/office/drawing/2016/5/11/chartex" xmlns:cx6="http://schemas.microsoft.com/office/drawing/2016/5/12/chartex" xmlns:cx7="http://schemas.microsoft.com/office/drawing/2016/5/13/chartex" xmlns:cx8="http://schemas.microsoft.com/office/drawing/2016/5/14/chartex" xmlns:mc="http://schemas.openxmlformats.org/markup-compatibility/2006" xmlns:aink="http://schemas.microsoft.com/office/drawing/2016/ink" xmlns:am3d="http://schemas.microsoft.com/office/drawing/2017/model3d" xmlns:o="urn:schemas-microsoft-com:office:office" xmlns:r="http://schemas.openxmlformats.org/officeDocument/2006/relationships" xmlns:m="http://schemas.openxmlformats.org/officeDocument/2006/math" xmlns:v="urn:schemas-microsoft-com:vml" xmlns:wp14="http://schemas.microsoft.com/office/word/2010/wordprocessingDrawing" xmlns:wp="http://schemas.openxmlformats.org/drawingml/2006/wordprocessingDrawing" xmlns:w10="urn:schemas-microsoft-com:office:word" xmlns:w="http://schemas.openxmlformats.org/wordprocessingml/2006/main" xmlns:w14="http://schemas.microsoft.com/office/word/2010/wordml" xmlns:w15="http://schemas.microsoft.com/office/word/2012/wordml" xmlns:w16cex="http://schemas.microsoft.com/office/word/2018/wordml/cex" xmlns:w16cid="http://schemas.microsoft.com/office/word/2016/wordml/cid" xmlns:w16="http://schemas.microsoft.com/office/word/2018/wordml" xmlns:w16se="http://schemas.microsoft.com/office/word/2015/wordml/symex" xmlns:wpg="http://schemas.microsoft.com/office/word/2010/wordprocessingGroup" xmlns:wpi="http://schemas.microsoft.com/office/word/2010/wordprocessingInk" xmlns:wne="http://schemas.microsoft.com/office/word/2006/wordml" xmlns:wps="http://schemas.microsoft.com/office/word/2010/wordprocessingShape" mc:Ignorable="w14 w15 w16se w16cid w16 w16cex wp14">
   <w:footnote w:type="separator" w:id="-1">
     <w:p>
       <w:r>
@@ -2678,7 +2686,7 @@
 </file>
 
 <file path=word/numbering.xml><?xml version="1.0" encoding="utf-8"?>
-<w:numbering xmlns:wpc="http://schemas.microsoft.com/office/word/2010/wordprocessingCanvas" xmlns:cx="http://schemas.microsoft.com/office/drawing/2014/chartex" xmlns:cx1="http://schemas.microsoft.com/office/drawing/2015/9/8/chartex" xmlns:cx2="http://schemas.microsoft.com/office/drawing/2015/10/21/chartex" xmlns:cx3="http://schemas.microsoft.com/office/drawing/2016/5/9/chartex" xmlns:cx4="http://schemas.microsoft.com/office/drawing/2016/5/10/chartex" xmlns:cx5="http://schemas.microsoft.com/office/drawing/2016/5/11/chartex" xmlns:cx6="http://schemas.microsoft.com/office/drawing/2016/5/12/chartex" xmlns:cx7="http://schemas.microsoft.com/office/drawing/2016/5/13/chartex" xmlns:cx8="http://schemas.microsoft.com/office/drawing/2016/5/14/chartex" xmlns:mc="http://schemas.openxmlformats.org/markup-compatibility/2006" xmlns:aink="http://schemas.microsoft.com/office/drawing/2016/ink" xmlns:am3d="http://schemas.microsoft.com/office/drawing/2017/model3d" xmlns:o="urn:schemas-microsoft-com:office:office" xmlns:r="http://schemas.openxmlformats.org/officeDocument/2006/relationships" xmlns:m="http://schemas.openxmlformats.org/officeDocument/2006/math" xmlns:v="urn:schemas-microsoft-com:vml" xmlns:wp14="http://schemas.microsoft.com/office/word/2010/wordprocessingDrawing" xmlns:wp="http://schemas.openxmlformats.org/drawingml/2006/wordprocessingDrawing" xmlns:w10="urn:schemas-microsoft-com:office:word" xmlns:w="http://schemas.openxmlformats.org/wordprocessingml/2006/main" xmlns:w14="http://schemas.microsoft.com/office/word/2010/wordml" xmlns:w15="http://schemas.microsoft.com/office/word/2012/wordml" xmlns:w16cex="http://schemas.microsoft.com/office/word/2018/wordml/cex" xmlns:w16cid="http://schemas.microsoft.com/office/word/2016/wordml/cid" xmlns:w16="http://schemas.microsoft.com/office/word/2018/wordml" xmlns:w16sdtdh="http://schemas.microsoft.com/office/word/2020/wordml/sdtdatahash" xmlns:w16se="http://schemas.microsoft.com/office/word/2015/wordml/symex" xmlns:wpg="http://schemas.microsoft.com/office/word/2010/wordprocessingGroup" xmlns:wpi="http://schemas.microsoft.com/office/word/2010/wordprocessingInk" xmlns:wne="http://schemas.microsoft.com/office/word/2006/wordml" xmlns:wps="http://schemas.microsoft.com/office/word/2010/wordprocessingShape" mc:Ignorable="w14 w15 w16se w16cid w16 w16cex w16sdtdh wp14">
+<w:numbering xmlns:wpc="http://schemas.microsoft.com/office/word/2010/wordprocessingCanvas" xmlns:cx="http://schemas.microsoft.com/office/drawing/2014/chartex" xmlns:cx1="http://schemas.microsoft.com/office/drawing/2015/9/8/chartex" xmlns:cx2="http://schemas.microsoft.com/office/drawing/2015/10/21/chartex" xmlns:cx3="http://schemas.microsoft.com/office/drawing/2016/5/9/chartex" xmlns:cx4="http://schemas.microsoft.com/office/drawing/2016/5/10/chartex" xmlns:cx5="http://schemas.microsoft.com/office/drawing/2016/5/11/chartex" xmlns:cx6="http://schemas.microsoft.com/office/drawing/2016/5/12/chartex" xmlns:cx7="http://schemas.microsoft.com/office/drawing/2016/5/13/chartex" xmlns:cx8="http://schemas.microsoft.com/office/drawing/2016/5/14/chartex" xmlns:mc="http://schemas.openxmlformats.org/markup-compatibility/2006" xmlns:aink="http://schemas.microsoft.com/office/drawing/2016/ink" xmlns:am3d="http://schemas.microsoft.com/office/drawing/2017/model3d" xmlns:o="urn:schemas-microsoft-com:office:office" xmlns:r="http://schemas.openxmlformats.org/officeDocument/2006/relationships" xmlns:m="http://schemas.openxmlformats.org/officeDocument/2006/math" xmlns:v="urn:schemas-microsoft-com:vml" xmlns:wp14="http://schemas.microsoft.com/office/word/2010/wordprocessingDrawing" xmlns:wp="http://schemas.openxmlformats.org/drawingml/2006/wordprocessingDrawing" xmlns:w10="urn:schemas-microsoft-com:office:word" xmlns:w="http://schemas.openxmlformats.org/wordprocessingml/2006/main" xmlns:w14="http://schemas.microsoft.com/office/word/2010/wordml" xmlns:w15="http://schemas.microsoft.com/office/word/2012/wordml" xmlns:w16cex="http://schemas.microsoft.com/office/word/2018/wordml/cex" xmlns:w16cid="http://schemas.microsoft.com/office/word/2016/wordml/cid" xmlns:w16="http://schemas.microsoft.com/office/word/2018/wordml" xmlns:w16se="http://schemas.microsoft.com/office/word/2015/wordml/symex" xmlns:wpg="http://schemas.microsoft.com/office/word/2010/wordprocessingGroup" xmlns:wpi="http://schemas.microsoft.com/office/word/2010/wordprocessingInk" xmlns:wne="http://schemas.microsoft.com/office/word/2006/wordml" xmlns:wps="http://schemas.microsoft.com/office/word/2010/wordprocessingShape" mc:Ignorable="w14 w15 w16se w16cid w16 w16cex wp14">
   <w:abstractNum w:abstractNumId="0" w15:restartNumberingAfterBreak="0">
     <w:nsid w:val="FFFFFF1D"/>
     <w:multiLevelType w:val="multilevel"/>
@@ -4486,12 +4494,12 @@
 </file>
 
 <file path=word/styles.xml><?xml version="1.0" encoding="utf-8"?>
-<w:styles xmlns:mc="http://schemas.openxmlformats.org/markup-compatibility/2006" xmlns:r="http://schemas.openxmlformats.org/officeDocument/2006/relationships" xmlns:w="http://schemas.openxmlformats.org/wordprocessingml/2006/main" xmlns:w14="http://schemas.microsoft.com/office/word/2010/wordml" xmlns:w15="http://schemas.microsoft.com/office/word/2012/wordml" xmlns:w16cex="http://schemas.microsoft.com/office/word/2018/wordml/cex" xmlns:w16cid="http://schemas.microsoft.com/office/word/2016/wordml/cid" xmlns:w16="http://schemas.microsoft.com/office/word/2018/wordml" xmlns:w16sdtdh="http://schemas.microsoft.com/office/word/2020/wordml/sdtdatahash" xmlns:w16se="http://schemas.microsoft.com/office/word/2015/wordml/symex" mc:Ignorable="w14 w15 w16se w16cid w16 w16cex w16sdtdh">
+<w:styles xmlns:mc="http://schemas.openxmlformats.org/markup-compatibility/2006" xmlns:r="http://schemas.openxmlformats.org/officeDocument/2006/relationships" xmlns:w="http://schemas.openxmlformats.org/wordprocessingml/2006/main" xmlns:w14="http://schemas.microsoft.com/office/word/2010/wordml" xmlns:w15="http://schemas.microsoft.com/office/word/2012/wordml" xmlns:w16cex="http://schemas.microsoft.com/office/word/2018/wordml/cex" xmlns:w16cid="http://schemas.microsoft.com/office/word/2016/wordml/cid" xmlns:w16="http://schemas.microsoft.com/office/word/2018/wordml" xmlns:w16se="http://schemas.microsoft.com/office/word/2015/wordml/symex" mc:Ignorable="w14 w15 w16se w16cid w16 w16cex">
   <w:docDefaults>
     <w:rPrDefault>
       <w:rPr>
         <w:rFonts w:ascii="Times New Roman" w:eastAsia="Times New Roman" w:hAnsi="Times New Roman" w:cs="Times New Roman"/>
-        <w:lang w:val="en-IN" w:eastAsia="en-GB" w:bidi="ar-SA"/>
+        <w:lang w:val="en-IN" w:eastAsia="en-US" w:bidi="ar-SA"/>
       </w:rPr>
     </w:rPrDefault>
     <w:pPrDefault/>
@@ -4784,7 +4792,7 @@
     <w:rPr>
       <w:sz w:val="24"/>
       <w:szCs w:val="24"/>
-      <w:lang w:val="en-US" w:eastAsia="en-US"/>
+      <w:lang w:val="en-US"/>
     </w:rPr>
   </w:style>
   <w:style w:type="paragraph" w:styleId="Heading1">

</xml_diff>